<commit_message>
regen(P2): batch 8 mau sau merge A/C — w:tbl + section_specs moi
PLII_M07/M06/M07/M08/M10/M13: loop/grid people D2.x sau regen --one;
PLI_M01/M02: fixed-matrix P2C (tai_san + nguon_von + tai_san_von_dieu_le);
form_maps sinh section_specs tuong ung. Generator deep idempotency 17/0.

Co-Authored-By: Claude <noreply@anthropic.com>
</commit_message>
<xml_diff>
--- a/app/templates/PLII_M07.docx
+++ b/app/templates/PLII_M07.docx
@@ -812,104 +812,371 @@
         <w:t xml:space="preserve"/>
       </w:r>
     </w:p>
-    <w:p>
-      <w:pPr>
-        <w:jc w:val="center"/>
-        <w:spacing w:before="120"/>
-      </w:pPr>
-      <w:r>
-        <w:rPr>
-          <w:rFonts w:ascii="Arial" w:hAnsi="Arial" w:cs="Arial"/>
-          <w:sz w:val="24"/>
-          <w:sz-cs w:val="24"/>
-        </w:rPr>
-        <w:t xml:space="preserve">STT</w:t>
-      </w:r>
-    </w:p>
-    <w:p>
-      <w:pPr>
-        <w:jc w:val="center"/>
-        <w:spacing w:before="120"/>
-      </w:pPr>
-      <w:r>
-        <w:rPr>
-          <w:rFonts w:ascii="Arial" w:hAnsi="Arial" w:cs="Arial"/>
-          <w:sz w:val="24"/>
-          <w:sz-cs w:val="24"/>
-        </w:rPr>
-        <w:t xml:space="preserve">Tên thành viên</w:t>
-      </w:r>
-    </w:p>
-    <w:p>
-      <w:pPr>
-        <w:jc w:val="center"/>
-        <w:spacing w:before="120"/>
-      </w:pPr>
-      <w:r>
-        <w:rPr>
-          <w:rFonts w:ascii="Arial" w:hAnsi="Arial" w:cs="Arial"/>
-          <w:sz w:val="24"/>
-          <w:sz-cs w:val="24"/>
-        </w:rPr>
-        <w:t xml:space="preserve">Quốc tịch</w:t>
-      </w:r>
-    </w:p>
-    <w:p>
-      <w:pPr>
-        <w:jc w:val="center"/>
-        <w:spacing w:before="120"/>
-      </w:pPr>
-      <w:r>
-        <w:rPr>
-          <w:rFonts w:ascii="Arial" w:hAnsi="Arial" w:cs="Arial"/>
-          <w:sz w:val="24"/>
-          <w:sz-cs w:val="24"/>
-        </w:rPr>
-        <w:t xml:space="preserve">Nơi ở hiện tại</w:t>
-      </w:r>
-    </w:p>
-    <w:p>
-      <w:pPr>
-        <w:jc w:val="center"/>
-        <w:spacing w:before="120"/>
-      </w:pPr>
-      <w:r>
-        <w:rPr>
-          <w:rFonts w:ascii="Arial" w:hAnsi="Arial" w:cs="Arial"/>
-          <w:sz w:val="24"/>
-          <w:sz-cs w:val="24"/>
-        </w:rPr>
-        <w:t xml:space="preserve">Nơi thường trú</w:t>
-      </w:r>
-    </w:p>
-    <w:p>
-      <w:pPr>
-        <w:jc w:val="center"/>
-        <w:spacing w:before="120"/>
-      </w:pPr>
-      <w:r>
-        <w:rPr>
-          <w:rFonts w:ascii="Arial" w:hAnsi="Arial" w:cs="Arial"/>
-          <w:sz w:val="24"/>
-          <w:sz-cs w:val="24"/>
-        </w:rPr>
-        <w:t xml:space="preserve">Số định danh cá nhân</w:t>
-      </w:r>
-    </w:p>
-    <w:p>
-      <w:pPr>
-        <w:jc w:val="center"/>
-        <w:spacing w:before="120"/>
-      </w:pPr>
-      <w:r>
-        <w:rPr>
-          <w:rFonts w:ascii="Arial" w:hAnsi="Arial" w:cs="Arial"/>
-          <w:sz w:val="24"/>
-          <w:sz-cs w:val="24"/>
-        </w:rPr>
-        <w:t xml:space="preserve">Ghi chú</w:t>
-      </w:r>
-    </w:p>
+    <w:tbl xmlns:ns0="urn:orca:p1a-temp">
+      <w:tblPr>
+        <w:tblW w:type="auto" w:w="0"/>
+        <w:tblLook w:firstColumn="1" w:firstRow="1" w:lastColumn="0" w:lastRow="0" w:noHBand="0" w:noVBand="1" w:val="04A0"/>
+        <w:tblBorders>
+          <w:top w:val="single" w:sz="4" w:color="000000"/>
+          <w:left w:val="single" w:sz="4" w:color="000000"/>
+          <w:bottom w:val="single" w:sz="4" w:color="000000"/>
+          <w:right w:val="single" w:sz="4" w:color="000000"/>
+          <w:insideH w:val="single" w:sz="4" w:color="000000"/>
+          <w:insideV w:val="single" w:sz="4" w:color="000000"/>
+        </w:tblBorders>
+      </w:tblPr>
+      <w:tblGrid>
+        <w:gridCol w:w="1234"/>
+        <w:gridCol w:w="1234"/>
+        <w:gridCol w:w="1234"/>
+        <w:gridCol w:w="1234"/>
+        <w:gridCol w:w="1234"/>
+        <w:gridCol w:w="1234"/>
+        <w:gridCol w:w="1234"/>
+      </w:tblGrid>
+      <w:tr>
+        <w:tc>
+          <w:tcPr>
+            <w:tcW w:type="dxa" w:w="1234"/>
+          </w:tcPr>
+          <w:p>
+            <w:r>
+              <w:rPr>
+                <w:b/>
+              </w:rPr>
+              <w:t>STT</w:t>
+            </w:r>
+          </w:p>
+        </w:tc>
+        <w:tc>
+          <w:tcPr>
+            <w:tcW w:type="dxa" w:w="1234"/>
+          </w:tcPr>
+          <w:p>
+            <w:r>
+              <w:rPr>
+                <w:b/>
+              </w:rPr>
+              <w:t>Tên thành viên</w:t>
+            </w:r>
+          </w:p>
+        </w:tc>
+        <w:tc>
+          <w:tcPr>
+            <w:tcW w:type="dxa" w:w="1234"/>
+          </w:tcPr>
+          <w:p>
+            <w:r>
+              <w:rPr>
+                <w:b/>
+              </w:rPr>
+              <w:t>Quốc tịch</w:t>
+            </w:r>
+          </w:p>
+        </w:tc>
+        <w:tc>
+          <w:tcPr>
+            <w:tcW w:type="dxa" w:w="1234"/>
+          </w:tcPr>
+          <w:p>
+            <w:r>
+              <w:rPr>
+                <w:b/>
+              </w:rPr>
+              <w:t>Nơi ở hiện tại</w:t>
+            </w:r>
+          </w:p>
+        </w:tc>
+        <w:tc>
+          <w:tcPr>
+            <w:tcW w:type="dxa" w:w="1234"/>
+          </w:tcPr>
+          <w:p>
+            <w:r>
+              <w:rPr>
+                <w:b/>
+              </w:rPr>
+              <w:t>Nơi thường trú</w:t>
+            </w:r>
+          </w:p>
+        </w:tc>
+        <w:tc>
+          <w:tcPr>
+            <w:tcW w:type="dxa" w:w="1234"/>
+          </w:tcPr>
+          <w:p>
+            <w:r>
+              <w:rPr>
+                <w:b/>
+              </w:rPr>
+              <w:t>Số định danh cá nhân</w:t>
+            </w:r>
+          </w:p>
+        </w:tc>
+        <w:tc>
+          <w:tcPr>
+            <w:tcW w:type="dxa" w:w="1234"/>
+          </w:tcPr>
+          <w:p>
+            <w:r>
+              <w:rPr>
+                <w:b/>
+              </w:rPr>
+              <w:t>Ghi chú</w:t>
+            </w:r>
+          </w:p>
+        </w:tc>
+      </w:tr>
+      <w:tr>
+        <w:tc>
+          <w:tcPr>
+            <w:tcW w:type="dxa" w:w="1234"/>
+          </w:tcPr>
+          <w:p/>
+        </w:tc>
+        <w:tc>
+          <w:tcPr>
+            <w:tcW w:type="dxa" w:w="1234"/>
+          </w:tcPr>
+          <w:p/>
+        </w:tc>
+        <w:tc>
+          <w:tcPr>
+            <w:tcW w:type="dxa" w:w="1234"/>
+          </w:tcPr>
+          <w:p/>
+        </w:tc>
+        <w:tc>
+          <w:tcPr>
+            <w:tcW w:type="dxa" w:w="1234"/>
+          </w:tcPr>
+          <w:p/>
+        </w:tc>
+        <w:tc>
+          <w:tcPr>
+            <w:tcW w:type="dxa" w:w="1234"/>
+          </w:tcPr>
+          <w:p/>
+        </w:tc>
+        <w:tc>
+          <w:tcPr>
+            <w:tcW w:type="dxa" w:w="1234"/>
+          </w:tcPr>
+          <w:p/>
+        </w:tc>
+        <w:tc>
+          <w:tcPr>
+            <w:tcW w:type="dxa" w:w="1234"/>
+          </w:tcPr>
+          <w:p/>
+        </w:tc>
+      </w:tr>
+      <w:tr>
+        <w:tc>
+          <w:tcPr>
+            <w:tcW w:type="dxa" w:w="1234"/>
+          </w:tcPr>
+          <w:p/>
+        </w:tc>
+        <w:tc>
+          <w:tcPr>
+            <w:tcW w:type="dxa" w:w="1234"/>
+          </w:tcPr>
+          <w:p/>
+        </w:tc>
+        <w:tc>
+          <w:tcPr>
+            <w:tcW w:type="dxa" w:w="1234"/>
+          </w:tcPr>
+          <w:p/>
+        </w:tc>
+        <w:tc>
+          <w:tcPr>
+            <w:tcW w:type="dxa" w:w="1234"/>
+          </w:tcPr>
+          <w:p/>
+        </w:tc>
+        <w:tc>
+          <w:tcPr>
+            <w:tcW w:type="dxa" w:w="1234"/>
+          </w:tcPr>
+          <w:p/>
+        </w:tc>
+        <w:tc>
+          <w:tcPr>
+            <w:tcW w:type="dxa" w:w="1234"/>
+          </w:tcPr>
+          <w:p/>
+        </w:tc>
+        <w:tc>
+          <w:tcPr>
+            <w:tcW w:type="dxa" w:w="1234"/>
+          </w:tcPr>
+          <w:p/>
+        </w:tc>
+      </w:tr>
+      <w:tr>
+        <w:tc>
+          <w:tcPr>
+            <w:tcW w:type="dxa" w:w="1234"/>
+          </w:tcPr>
+          <w:p/>
+        </w:tc>
+        <w:tc>
+          <w:tcPr>
+            <w:tcW w:type="dxa" w:w="1234"/>
+          </w:tcPr>
+          <w:p/>
+        </w:tc>
+        <w:tc>
+          <w:tcPr>
+            <w:tcW w:type="dxa" w:w="1234"/>
+          </w:tcPr>
+          <w:p/>
+        </w:tc>
+        <w:tc>
+          <w:tcPr>
+            <w:tcW w:type="dxa" w:w="1234"/>
+          </w:tcPr>
+          <w:p/>
+        </w:tc>
+        <w:tc>
+          <w:tcPr>
+            <w:tcW w:type="dxa" w:w="1234"/>
+          </w:tcPr>
+          <w:p/>
+        </w:tc>
+        <w:tc>
+          <w:tcPr>
+            <w:tcW w:type="dxa" w:w="1234"/>
+          </w:tcPr>
+          <w:p/>
+        </w:tc>
+        <w:tc>
+          <w:tcPr>
+            <w:tcW w:type="dxa" w:w="1234"/>
+          </w:tcPr>
+          <w:p/>
+        </w:tc>
+      </w:tr>
+      <w:tr>
+        <w:tc>
+          <w:tcPr>
+            <w:tcW w:type="dxa" w:w="1234"/>
+          </w:tcPr>
+          <w:p/>
+        </w:tc>
+        <w:tc>
+          <w:tcPr>
+            <w:tcW w:type="dxa" w:w="1234"/>
+          </w:tcPr>
+          <w:p/>
+        </w:tc>
+        <w:tc>
+          <w:tcPr>
+            <w:tcW w:type="dxa" w:w="1234"/>
+          </w:tcPr>
+          <w:p/>
+        </w:tc>
+        <w:tc>
+          <w:tcPr>
+            <w:tcW w:type="dxa" w:w="1234"/>
+          </w:tcPr>
+          <w:p/>
+        </w:tc>
+        <w:tc>
+          <w:tcPr>
+            <w:tcW w:type="dxa" w:w="1234"/>
+          </w:tcPr>
+          <w:p/>
+        </w:tc>
+        <w:tc>
+          <w:tcPr>
+            <w:tcW w:type="dxa" w:w="1234"/>
+          </w:tcPr>
+          <w:p/>
+        </w:tc>
+        <w:tc>
+          <w:tcPr>
+            <w:tcW w:type="dxa" w:w="1234"/>
+          </w:tcPr>
+          <w:p/>
+        </w:tc>
+      </w:tr>
+      <w:tr>
+        <w:tc>
+          <w:tcPr>
+            <w:tcW w:type="dxa" w:w="1234"/>
+          </w:tcPr>
+          <w:p>
+            <w:r>
+              <w:t>{#ds_thanh_vien_hkd_gcn}{_stt}</w:t>
+            </w:r>
+          </w:p>
+        </w:tc>
+        <w:tc>
+          <w:tcPr>
+            <w:tcW w:type="dxa" w:w="1234"/>
+          </w:tcPr>
+          <w:p>
+            <w:r>
+              <w:t>{ten_thanh_vien}</w:t>
+            </w:r>
+          </w:p>
+        </w:tc>
+        <w:tc>
+          <w:tcPr>
+            <w:tcW w:type="dxa" w:w="1234"/>
+          </w:tcPr>
+          <w:p>
+            <w:r>
+              <w:t>{quoc_tich}</w:t>
+            </w:r>
+          </w:p>
+        </w:tc>
+        <w:tc>
+          <w:tcPr>
+            <w:tcW w:type="dxa" w:w="1234"/>
+          </w:tcPr>
+          <w:p>
+            <w:r>
+              <w:t>{noi_o_hien_tai}</w:t>
+            </w:r>
+          </w:p>
+        </w:tc>
+        <w:tc>
+          <w:tcPr>
+            <w:tcW w:type="dxa" w:w="1234"/>
+          </w:tcPr>
+          <w:p>
+            <w:r>
+              <w:t>{noi_thuong_tru}</w:t>
+            </w:r>
+          </w:p>
+        </w:tc>
+        <w:tc>
+          <w:tcPr>
+            <w:tcW w:type="dxa" w:w="1234"/>
+          </w:tcPr>
+          <w:p>
+            <w:r>
+              <w:t>{so_cccd}</w:t>
+            </w:r>
+          </w:p>
+        </w:tc>
+        <w:tc>
+          <w:tcPr>
+            <w:tcW w:type="dxa" w:w="1234"/>
+          </w:tcPr>
+          <w:p>
+            <w:r>
+              <w:t>{ghi_chu}{/ds_thanh_vien_hkd_gcn}</w:t>
+            </w:r>
+          </w:p>
+        </w:tc>
+      </w:tr>
+    </w:tbl>
+    <w:p/>
     <w:p>
       <w:pPr>
         <w:jc w:val="center"/>

</xml_diff>